<commit_message>
Added seperate files for making the project more structured
</commit_message>
<xml_diff>
--- a/Documentation.docx
+++ b/Documentation.docx
@@ -172,6 +172,1376 @@
           <w:lang w:val="en-US"/>
         </w:rPr>
         <w:t>It is a network scanning and vulnerability assessment report using Nmap, identifying exposed services, documenting risks and recommending remediation steps.</w:t>
+      </w:r>
+    </w:p>
+    <w:p>
+      <w:pPr>
+        <w:pStyle w:val="Heading1"/>
+        <w:rPr>
+          <w:lang w:val="en-US"/>
+        </w:rPr>
+      </w:pPr>
+      <w:r>
+        <w:rPr>
+          <w:lang w:val="en-US"/>
+        </w:rPr>
+        <w:t>Building</w:t>
+      </w:r>
+    </w:p>
+    <w:p>
+      <w:pPr>
+        <w:pStyle w:val="Heading2"/>
+        <w:rPr>
+          <w:lang w:val="en-US"/>
+        </w:rPr>
+      </w:pPr>
+      <w:r>
+        <w:rPr>
+          <w:lang w:val="en-US"/>
+        </w:rPr>
+        <w:t xml:space="preserve">Phase 1 </w:t>
+      </w:r>
+      <w:r>
+        <w:rPr>
+          <w:lang w:val="en-US"/>
+        </w:rPr>
+        <w:t xml:space="preserve">- </w:t>
+      </w:r>
+      <w:r>
+        <w:rPr>
+          <w:lang w:val="en-US"/>
+        </w:rPr>
+        <w:t>Understanding the Environment.</w:t>
+      </w:r>
+    </w:p>
+    <w:p>
+      <w:pPr>
+        <w:rPr>
+          <w:sz w:val="28"/>
+          <w:szCs w:val="28"/>
+          <w:lang w:val="en-US"/>
+        </w:rPr>
+      </w:pPr>
+      <w:r>
+        <w:rPr>
+          <w:sz w:val="28"/>
+          <w:szCs w:val="28"/>
+          <w:lang w:val="en-US"/>
+        </w:rPr>
+        <w:t>First, we need to understand basic terms that will be helpful in our building journey.</w:t>
+      </w:r>
+    </w:p>
+    <w:p>
+      <w:pPr>
+        <w:rPr>
+          <w:b/>
+          <w:bCs/>
+          <w:sz w:val="28"/>
+          <w:szCs w:val="28"/>
+          <w:lang w:val="en-US"/>
+        </w:rPr>
+      </w:pPr>
+      <w:r>
+        <w:rPr>
+          <w:b/>
+          <w:bCs/>
+          <w:sz w:val="28"/>
+          <w:szCs w:val="28"/>
+          <w:lang w:val="en-US"/>
+        </w:rPr>
+        <w:t>IP vs Ports:</w:t>
+      </w:r>
+    </w:p>
+    <w:p>
+      <w:pPr>
+        <w:pStyle w:val="ListParagraph"/>
+        <w:numPr>
+          <w:ilvl w:val="0"/>
+          <w:numId w:val="2"/>
+        </w:numPr>
+        <w:rPr>
+          <w:b/>
+          <w:bCs/>
+          <w:sz w:val="28"/>
+          <w:szCs w:val="28"/>
+          <w:lang w:val="en-US"/>
+        </w:rPr>
+      </w:pPr>
+      <w:r>
+        <w:rPr>
+          <w:sz w:val="28"/>
+          <w:szCs w:val="28"/>
+          <w:lang w:val="en-US"/>
+        </w:rPr>
+        <w:t xml:space="preserve">Consider an IP as an address of our device in a network. </w:t>
+      </w:r>
+      <w:r>
+        <w:rPr>
+          <w:sz w:val="28"/>
+          <w:szCs w:val="28"/>
+          <w:lang w:val="en-US"/>
+        </w:rPr>
+        <w:t>Ports</w:t>
+      </w:r>
+      <w:r>
+        <w:rPr>
+          <w:sz w:val="28"/>
+          <w:szCs w:val="28"/>
+          <w:lang w:val="en-US"/>
+        </w:rPr>
+        <w:t xml:space="preserve"> are in fact the </w:t>
+      </w:r>
+      <w:r>
+        <w:rPr>
+          <w:sz w:val="28"/>
+          <w:szCs w:val="28"/>
+          <w:lang w:val="en-US"/>
+        </w:rPr>
+        <w:t>apartments that are connected to our address. Two different things</w:t>
+      </w:r>
+      <w:r>
+        <w:rPr>
+          <w:sz w:val="28"/>
+          <w:szCs w:val="28"/>
+          <w:lang w:val="en-US"/>
+        </w:rPr>
+        <w:t>, yet very similar.</w:t>
+      </w:r>
+    </w:p>
+    <w:p>
+      <w:pPr>
+        <w:rPr>
+          <w:b/>
+          <w:bCs/>
+          <w:sz w:val="28"/>
+          <w:szCs w:val="28"/>
+          <w:lang w:val="en-US"/>
+        </w:rPr>
+      </w:pPr>
+      <w:r>
+        <w:rPr>
+          <w:b/>
+          <w:bCs/>
+          <w:sz w:val="28"/>
+          <w:szCs w:val="28"/>
+          <w:lang w:val="en-US"/>
+        </w:rPr>
+        <w:t>Why is an open port a high risk?</w:t>
+      </w:r>
+    </w:p>
+    <w:p>
+      <w:pPr>
+        <w:pStyle w:val="ListParagraph"/>
+        <w:numPr>
+          <w:ilvl w:val="0"/>
+          <w:numId w:val="2"/>
+        </w:numPr>
+        <w:rPr>
+          <w:b/>
+          <w:bCs/>
+          <w:sz w:val="28"/>
+          <w:szCs w:val="28"/>
+          <w:lang w:val="en-US"/>
+        </w:rPr>
+      </w:pPr>
+      <w:r>
+        <w:rPr>
+          <w:sz w:val="28"/>
+          <w:szCs w:val="28"/>
+          <w:lang w:val="en-US"/>
+        </w:rPr>
+        <w:t>An open port could be considered a high risk to our network because if the service running on that port is outdated, misconfigured or weak attackers could gain unauthorized access very easily.</w:t>
+      </w:r>
+    </w:p>
+    <w:p>
+      <w:pPr>
+        <w:rPr>
+          <w:b/>
+          <w:bCs/>
+          <w:sz w:val="28"/>
+          <w:szCs w:val="28"/>
+          <w:lang w:val="en-US"/>
+        </w:rPr>
+      </w:pPr>
+      <w:r>
+        <w:rPr>
+          <w:b/>
+          <w:bCs/>
+          <w:sz w:val="28"/>
+          <w:szCs w:val="28"/>
+          <w:lang w:val="en-US"/>
+        </w:rPr>
+        <w:t xml:space="preserve">Why making a project with Nmap is more valuable than just </w:t>
+      </w:r>
+      <w:r>
+        <w:rPr>
+          <w:b/>
+          <w:bCs/>
+          <w:sz w:val="28"/>
+          <w:szCs w:val="28"/>
+          <w:lang w:val="en-US"/>
+        </w:rPr>
+        <w:t>saying “</w:t>
+      </w:r>
+      <w:r>
+        <w:rPr>
+          <w:b/>
+          <w:bCs/>
+          <w:sz w:val="28"/>
+          <w:szCs w:val="28"/>
+          <w:lang w:val="en-US"/>
+        </w:rPr>
+        <w:t>I know how Nmap works”?</w:t>
+      </w:r>
+    </w:p>
+    <w:p>
+      <w:pPr>
+        <w:pStyle w:val="ListParagraph"/>
+        <w:numPr>
+          <w:ilvl w:val="0"/>
+          <w:numId w:val="2"/>
+        </w:numPr>
+        <w:rPr>
+          <w:b/>
+          <w:bCs/>
+          <w:sz w:val="28"/>
+          <w:szCs w:val="28"/>
+          <w:lang w:val="en-US"/>
+        </w:rPr>
+      </w:pPr>
+      <w:r>
+        <w:rPr>
+          <w:b/>
+          <w:bCs/>
+          <w:sz w:val="28"/>
+          <w:szCs w:val="28"/>
+          <w:lang w:val="en-US"/>
+        </w:rPr>
+        <w:lastRenderedPageBreak/>
+        <w:t xml:space="preserve"> </w:t>
+      </w:r>
+      <w:r>
+        <w:rPr>
+          <w:sz w:val="28"/>
+          <w:szCs w:val="28"/>
+          <w:lang w:val="en-US"/>
+        </w:rPr>
+        <w:t xml:space="preserve">Having </w:t>
+      </w:r>
+      <w:r>
+        <w:rPr>
+          <w:sz w:val="28"/>
+          <w:szCs w:val="28"/>
+          <w:lang w:val="en-US"/>
+        </w:rPr>
+        <w:t xml:space="preserve">a complete project using Nmap proves the understanding of fundamental cybersecurity concepts </w:t>
+      </w:r>
+      <w:r>
+        <w:rPr>
+          <w:sz w:val="28"/>
+          <w:szCs w:val="28"/>
+          <w:lang w:val="en-US"/>
+        </w:rPr>
+        <w:t>such as</w:t>
+      </w:r>
+      <w:r>
+        <w:rPr>
+          <w:sz w:val="28"/>
+          <w:szCs w:val="28"/>
+          <w:lang w:val="en-US"/>
+        </w:rPr>
+        <w:t xml:space="preserve"> networks, risk assessments, </w:t>
+      </w:r>
+      <w:r>
+        <w:rPr>
+          <w:sz w:val="28"/>
+          <w:szCs w:val="28"/>
+          <w:lang w:val="en-US"/>
+        </w:rPr>
+        <w:t>network protocols, etc.</w:t>
+      </w:r>
+    </w:p>
+    <w:p>
+      <w:pPr>
+        <w:pStyle w:val="Heading2"/>
+        <w:rPr>
+          <w:lang w:val="en-US"/>
+        </w:rPr>
+      </w:pPr>
+      <w:r>
+        <w:rPr>
+          <w:lang w:val="en-US"/>
+        </w:rPr>
+        <w:t xml:space="preserve">Phase 2 </w:t>
+      </w:r>
+      <w:r>
+        <w:rPr>
+          <w:lang w:val="en-US"/>
+        </w:rPr>
+        <w:t xml:space="preserve">- </w:t>
+      </w:r>
+      <w:r>
+        <w:rPr>
+          <w:lang w:val="en-US"/>
+        </w:rPr>
+        <w:t>Setting up an Ubuntu Server</w:t>
+      </w:r>
+    </w:p>
+    <w:p>
+      <w:pPr>
+        <w:rPr>
+          <w:sz w:val="28"/>
+          <w:szCs w:val="28"/>
+          <w:lang w:val="en-US"/>
+        </w:rPr>
+      </w:pPr>
+      <w:r>
+        <w:rPr>
+          <w:sz w:val="28"/>
+          <w:szCs w:val="28"/>
+          <w:lang w:val="en-US"/>
+        </w:rPr>
+        <w:t>To begin testing and creating this project, I installed VirtualBox and set up an Ubuntu Server VM to have as a target machine.</w:t>
+      </w:r>
+      <w:r>
+        <w:rPr>
+          <w:sz w:val="28"/>
+          <w:szCs w:val="28"/>
+          <w:lang w:val="en-US"/>
+        </w:rPr>
+        <w:t xml:space="preserve"> Afterwards, with the commands </w:t>
+      </w:r>
+      <w:r>
+        <w:rPr>
+          <w:b/>
+          <w:bCs/>
+          <w:sz w:val="28"/>
+          <w:szCs w:val="28"/>
+          <w:lang w:val="en-US"/>
+        </w:rPr>
+        <w:t xml:space="preserve">ip addr </w:t>
+      </w:r>
+      <w:r>
+        <w:rPr>
+          <w:sz w:val="28"/>
+          <w:szCs w:val="28"/>
+          <w:lang w:val="en-US"/>
+        </w:rPr>
+        <w:t xml:space="preserve">and </w:t>
+      </w:r>
+      <w:r>
+        <w:rPr>
+          <w:b/>
+          <w:bCs/>
+          <w:sz w:val="28"/>
+          <w:szCs w:val="28"/>
+          <w:lang w:val="en-US"/>
+        </w:rPr>
+        <w:t>ss -tuln</w:t>
+      </w:r>
+      <w:r>
+        <w:rPr>
+          <w:b/>
+          <w:bCs/>
+          <w:sz w:val="28"/>
+          <w:szCs w:val="28"/>
+          <w:lang w:val="en-US"/>
+        </w:rPr>
+        <w:t xml:space="preserve"> </w:t>
+      </w:r>
+      <w:r>
+        <w:rPr>
+          <w:sz w:val="28"/>
+          <w:szCs w:val="28"/>
+          <w:lang w:val="en-US"/>
+        </w:rPr>
+        <w:t xml:space="preserve">I managed to get informed about the VM’s IP address and the TCP/UDP services that were listening at its network. </w:t>
+      </w:r>
+    </w:p>
+    <w:p>
+      <w:pPr>
+        <w:rPr>
+          <w:sz w:val="28"/>
+          <w:szCs w:val="28"/>
+          <w:lang w:val="en-US"/>
+        </w:rPr>
+      </w:pPr>
+      <w:r>
+        <w:rPr>
+          <w:sz w:val="28"/>
+          <w:szCs w:val="28"/>
+          <w:lang w:val="en-US"/>
+        </w:rPr>
+        <w:t xml:space="preserve">Furthermore, having confirmed the fact that the target machine and the scanning machine were on the same network, pinging was done to prove that our destination is reachable. </w:t>
+      </w:r>
+    </w:p>
+    <w:p>
+      <w:pPr>
+        <w:rPr>
+          <w:sz w:val="28"/>
+          <w:szCs w:val="28"/>
+          <w:lang w:val="en-US"/>
+        </w:rPr>
+      </w:pPr>
+      <w:r>
+        <w:rPr>
+          <w:sz w:val="28"/>
+          <w:szCs w:val="28"/>
+          <w:lang w:val="en-US"/>
+        </w:rPr>
+        <w:t xml:space="preserve">I even installed </w:t>
+      </w:r>
+      <w:r>
+        <w:rPr>
+          <w:sz w:val="28"/>
+          <w:szCs w:val="28"/>
+          <w:lang w:val="en-US"/>
+        </w:rPr>
+        <w:t>OpenSSH</w:t>
+      </w:r>
+      <w:r>
+        <w:rPr>
+          <w:sz w:val="28"/>
+          <w:szCs w:val="28"/>
+          <w:lang w:val="en-US"/>
+        </w:rPr>
+        <w:t xml:space="preserve"> to the ubuntu machine, so that a service would actively run and use a port, for my </w:t>
+      </w:r>
+      <w:r>
+        <w:rPr>
+          <w:sz w:val="28"/>
+          <w:szCs w:val="28"/>
+          <w:lang w:val="en-US"/>
+        </w:rPr>
+        <w:t>Nmap</w:t>
+      </w:r>
+      <w:r>
+        <w:rPr>
+          <w:sz w:val="28"/>
+          <w:szCs w:val="28"/>
+          <w:lang w:val="en-US"/>
+        </w:rPr>
+        <w:t xml:space="preserve"> scan to be successful.</w:t>
+      </w:r>
+    </w:p>
+    <w:p>
+      <w:pPr>
+        <w:rPr>
+          <w:b/>
+          <w:bCs/>
+          <w:sz w:val="28"/>
+          <w:szCs w:val="28"/>
+          <w:lang w:val="en-US"/>
+        </w:rPr>
+      </w:pPr>
+      <w:r>
+        <w:rPr>
+          <w:b/>
+          <w:bCs/>
+          <w:sz w:val="28"/>
+          <w:szCs w:val="28"/>
+          <w:lang w:val="en-US"/>
+        </w:rPr>
+        <w:t>Problems during tests:</w:t>
+      </w:r>
+    </w:p>
+    <w:p>
+      <w:pPr>
+        <w:rPr>
+          <w:sz w:val="28"/>
+          <w:szCs w:val="28"/>
+          <w:lang w:val="en-US"/>
+        </w:rPr>
+      </w:pPr>
+      <w:r>
+        <w:rPr>
+          <w:sz w:val="28"/>
+          <w:szCs w:val="28"/>
+          <w:lang w:val="en-US"/>
+        </w:rPr>
+        <w:t xml:space="preserve">First, I was put up against the fact that my VM was in a NAT network. This means that all network protocols and settings are managed by VirtualBox and that the VM is connected to a network in VirtualBox, and VirtualBox is connected to my device’s network. </w:t>
+      </w:r>
+      <w:r>
+        <w:rPr>
+          <w:sz w:val="28"/>
+          <w:szCs w:val="28"/>
+          <w:lang w:val="en-US"/>
+        </w:rPr>
+        <w:t>The virtual machine was reconfigured from NAT to a Bridget Adapter so that it would obtain an IP address from the local network and behave as a separate host.</w:t>
+      </w:r>
+    </w:p>
+    <w:p>
+      <w:pPr>
+        <w:rPr>
+          <w:sz w:val="28"/>
+          <w:szCs w:val="28"/>
+          <w:lang w:val="en-US"/>
+        </w:rPr>
+      </w:pPr>
+      <w:r>
+        <w:rPr>
+          <w:sz w:val="28"/>
+          <w:szCs w:val="28"/>
+          <w:lang w:val="en-US"/>
+        </w:rPr>
+        <w:t>Later,</w:t>
+      </w:r>
+      <w:r>
+        <w:rPr>
+          <w:sz w:val="28"/>
+          <w:szCs w:val="28"/>
+          <w:lang w:val="en-US"/>
+        </w:rPr>
+        <w:t xml:space="preserve"> </w:t>
+      </w:r>
+      <w:r>
+        <w:rPr>
+          <w:sz w:val="28"/>
+          <w:szCs w:val="28"/>
+          <w:lang w:val="en-US"/>
+        </w:rPr>
+        <w:t xml:space="preserve">I encountered a problem with my first scan. After running </w:t>
+      </w:r>
+      <w:r>
+        <w:rPr>
+          <w:b/>
+          <w:bCs/>
+          <w:sz w:val="28"/>
+          <w:szCs w:val="28"/>
+          <w:lang w:val="en-US"/>
+        </w:rPr>
+        <w:t>nmap &lt;ip&gt;</w:t>
+      </w:r>
+      <w:r>
+        <w:rPr>
+          <w:sz w:val="28"/>
+          <w:szCs w:val="28"/>
+          <w:lang w:val="en-US"/>
+        </w:rPr>
+        <w:t>, even though our destination was reachable and with ssh running, it returned that 0 hosts were up</w:t>
+      </w:r>
+      <w:r>
+        <w:rPr>
+          <w:sz w:val="28"/>
+          <w:szCs w:val="28"/>
+          <w:lang w:val="en-US"/>
+        </w:rPr>
+        <w:t xml:space="preserve">. I tried </w:t>
+      </w:r>
+      <w:r>
+        <w:rPr>
+          <w:b/>
+          <w:bCs/>
+          <w:sz w:val="28"/>
+          <w:szCs w:val="28"/>
+          <w:lang w:val="en-US"/>
+        </w:rPr>
+        <w:t xml:space="preserve">nmap -Pn &lt;ip&gt; </w:t>
+      </w:r>
+      <w:r>
+        <w:rPr>
+          <w:sz w:val="28"/>
+          <w:szCs w:val="28"/>
+          <w:lang w:val="en-US"/>
+        </w:rPr>
+        <w:t xml:space="preserve">which skips host </w:t>
+      </w:r>
+      <w:r>
+        <w:rPr>
+          <w:sz w:val="28"/>
+          <w:szCs w:val="28"/>
+          <w:lang w:val="en-US"/>
+        </w:rPr>
+        <w:t xml:space="preserve">discovery </w:t>
+      </w:r>
+      <w:r>
+        <w:rPr>
+          <w:sz w:val="28"/>
+          <w:szCs w:val="28"/>
+          <w:lang w:val="en-US"/>
+        </w:rPr>
+        <w:t xml:space="preserve">and </w:t>
+      </w:r>
+      <w:r>
+        <w:rPr>
+          <w:sz w:val="28"/>
+          <w:szCs w:val="28"/>
+          <w:lang w:val="en-US"/>
+        </w:rPr>
+        <w:t>proceeds with the scan, but it also did not work.</w:t>
+      </w:r>
+    </w:p>
+    <w:p>
+      <w:pPr>
+        <w:rPr>
+          <w:sz w:val="28"/>
+          <w:szCs w:val="28"/>
+          <w:lang w:val="en-US"/>
+        </w:rPr>
+      </w:pPr>
+      <w:r>
+        <w:rPr>
+          <w:sz w:val="28"/>
+          <w:szCs w:val="28"/>
+          <w:lang w:val="en-US"/>
+        </w:rPr>
+        <w:t>What worked was the nmap -sT -Pn -p 22 &lt;ip&gt; command in which:</w:t>
+      </w:r>
+    </w:p>
+    <w:p>
+      <w:pPr>
+        <w:pStyle w:val="ListParagraph"/>
+        <w:numPr>
+          <w:ilvl w:val="0"/>
+          <w:numId w:val="2"/>
+        </w:numPr>
+        <w:rPr>
+          <w:sz w:val="28"/>
+          <w:szCs w:val="28"/>
+          <w:lang w:val="en-US"/>
+        </w:rPr>
+      </w:pPr>
+      <w:r>
+        <w:rPr>
+          <w:sz w:val="28"/>
+          <w:szCs w:val="28"/>
+          <w:lang w:val="en-US"/>
+        </w:rPr>
+        <w:t xml:space="preserve">-sT </w:t>
+      </w:r>
+      <w:r>
+        <w:rPr>
+          <w:sz w:val="28"/>
+          <w:szCs w:val="28"/>
+          <w:lang w:val="en-US"/>
+        </w:rPr>
+        <w:t>performs a TCP Connect Scan by completing the three-way-handshake to determine whether a port is open</w:t>
+      </w:r>
+      <w:r>
+        <w:rPr>
+          <w:sz w:val="28"/>
+          <w:szCs w:val="28"/>
+          <w:lang w:val="en-US"/>
+        </w:rPr>
+        <w:t>.</w:t>
+      </w:r>
+    </w:p>
+    <w:p>
+      <w:pPr>
+        <w:pStyle w:val="ListParagraph"/>
+        <w:numPr>
+          <w:ilvl w:val="0"/>
+          <w:numId w:val="2"/>
+        </w:numPr>
+        <w:rPr>
+          <w:sz w:val="28"/>
+          <w:szCs w:val="28"/>
+          <w:lang w:val="en-US"/>
+        </w:rPr>
+      </w:pPr>
+      <w:r>
+        <w:rPr>
+          <w:sz w:val="28"/>
+          <w:szCs w:val="28"/>
+          <w:lang w:val="en-US"/>
+        </w:rPr>
+        <w:t>-Pn says to skip host discovery</w:t>
+      </w:r>
+    </w:p>
+    <w:p>
+      <w:pPr>
+        <w:pStyle w:val="ListParagraph"/>
+        <w:numPr>
+          <w:ilvl w:val="0"/>
+          <w:numId w:val="2"/>
+        </w:numPr>
+        <w:rPr>
+          <w:sz w:val="28"/>
+          <w:szCs w:val="28"/>
+          <w:lang w:val="en-US"/>
+        </w:rPr>
+      </w:pPr>
+      <w:r>
+        <w:rPr>
+          <w:sz w:val="28"/>
+          <w:szCs w:val="28"/>
+          <w:lang w:val="en-US"/>
+        </w:rPr>
+        <w:t>-p specifies the port we are looking for</w:t>
+      </w:r>
+      <w:r>
+        <w:rPr>
+          <w:sz w:val="28"/>
+          <w:szCs w:val="28"/>
+          <w:lang w:val="en-US"/>
+        </w:rPr>
+        <w:t xml:space="preserve">. In this situation, ssh uses </w:t>
+      </w:r>
+      <w:r>
+        <w:rPr>
+          <w:sz w:val="28"/>
+          <w:szCs w:val="28"/>
+          <w:lang w:val="en-US"/>
+        </w:rPr>
+        <w:t>port</w:t>
+      </w:r>
+      <w:r>
+        <w:rPr>
+          <w:sz w:val="28"/>
+          <w:szCs w:val="28"/>
+          <w:lang w:val="en-US"/>
+        </w:rPr>
+        <w:t xml:space="preserve"> 22</w:t>
+      </w:r>
+      <w:r>
+        <w:rPr>
+          <w:sz w:val="28"/>
+          <w:szCs w:val="28"/>
+          <w:lang w:val="en-US"/>
+        </w:rPr>
+        <w:t>.</w:t>
+      </w:r>
+    </w:p>
+    <w:p>
+      <w:pPr>
+        <w:pStyle w:val="Heading2"/>
+        <w:rPr>
+          <w:lang w:val="en-US"/>
+        </w:rPr>
+      </w:pPr>
+      <w:r>
+        <w:rPr>
+          <w:lang w:val="en-US"/>
+        </w:rPr>
+        <w:lastRenderedPageBreak/>
+        <w:t>Phase 3 – Testing</w:t>
+      </w:r>
+    </w:p>
+    <w:p>
+      <w:pPr>
+        <w:rPr>
+          <w:sz w:val="28"/>
+          <w:szCs w:val="28"/>
+          <w:lang w:val="en-US"/>
+        </w:rPr>
+      </w:pPr>
+      <w:r>
+        <w:rPr>
+          <w:sz w:val="28"/>
+          <w:szCs w:val="28"/>
+          <w:lang w:val="en-US"/>
+        </w:rPr>
+        <w:t xml:space="preserve">I already talked about how I connected and verified which </w:t>
+      </w:r>
+      <w:r>
+        <w:rPr>
+          <w:sz w:val="28"/>
+          <w:szCs w:val="28"/>
+          <w:lang w:val="en-US"/>
+        </w:rPr>
+        <w:t>service was</w:t>
+      </w:r>
+      <w:r>
+        <w:rPr>
+          <w:sz w:val="28"/>
+          <w:szCs w:val="28"/>
+          <w:lang w:val="en-US"/>
+        </w:rPr>
+        <w:t xml:space="preserve"> running on port 22. </w:t>
+      </w:r>
+      <w:r>
+        <w:rPr>
+          <w:sz w:val="28"/>
+          <w:szCs w:val="28"/>
+          <w:lang w:val="en-US"/>
+        </w:rPr>
+        <w:t xml:space="preserve">But </w:t>
+      </w:r>
+      <w:r>
+        <w:rPr>
+          <w:sz w:val="28"/>
+          <w:szCs w:val="28"/>
+          <w:lang w:val="en-US"/>
+        </w:rPr>
+        <w:t xml:space="preserve">it still is part of the process. </w:t>
+      </w:r>
+      <w:r>
+        <w:rPr>
+          <w:sz w:val="28"/>
+          <w:szCs w:val="28"/>
+          <w:lang w:val="en-US"/>
+        </w:rPr>
+        <w:t>Here is a full list of tests run on my Ubuntu (target) machine from my PC</w:t>
+      </w:r>
+      <w:r>
+        <w:rPr>
+          <w:sz w:val="28"/>
+          <w:szCs w:val="28"/>
+          <w:lang w:val="en-US"/>
+        </w:rPr>
+        <w:t>.</w:t>
+      </w:r>
+      <w:r>
+        <w:rPr>
+          <w:sz w:val="28"/>
+          <w:szCs w:val="28"/>
+          <w:lang w:val="en-US"/>
+        </w:rPr>
+        <w:t xml:space="preserve"> </w:t>
+      </w:r>
+    </w:p>
+    <w:p>
+      <w:pPr>
+        <w:rPr>
+          <w:sz w:val="28"/>
+          <w:szCs w:val="28"/>
+          <w:lang w:val="en-US"/>
+        </w:rPr>
+      </w:pPr>
+      <w:r>
+        <w:rPr>
+          <w:b/>
+          <w:bCs/>
+          <w:sz w:val="28"/>
+          <w:szCs w:val="28"/>
+          <w:lang w:val="en-US"/>
+        </w:rPr>
+        <w:t>Note:</w:t>
+      </w:r>
+      <w:r>
+        <w:rPr>
+          <w:sz w:val="28"/>
+          <w:szCs w:val="28"/>
+          <w:lang w:val="en-US"/>
+        </w:rPr>
+        <w:t xml:space="preserve"> I do not use the -p option here, because the only running service is SSH on port 22. </w:t>
+      </w:r>
+      <w:r>
+        <w:rPr>
+          <w:sz w:val="28"/>
+          <w:szCs w:val="28"/>
+          <w:lang w:val="en-US"/>
+        </w:rPr>
+        <w:t>If we had multiple services running on open ports, we would have to use -p.</w:t>
+      </w:r>
+    </w:p>
+    <w:p>
+      <w:pPr>
+        <w:pStyle w:val="ListParagraph"/>
+        <w:numPr>
+          <w:ilvl w:val="0"/>
+          <w:numId w:val="2"/>
+        </w:numPr>
+        <w:rPr>
+          <w:sz w:val="28"/>
+          <w:szCs w:val="28"/>
+          <w:lang w:val="en-US"/>
+        </w:rPr>
+      </w:pPr>
+      <w:r>
+        <w:rPr>
+          <w:b/>
+          <w:bCs/>
+          <w:sz w:val="28"/>
+          <w:szCs w:val="28"/>
+          <w:lang w:val="en-US"/>
+        </w:rPr>
+        <w:t>nmap -sT -Pn &lt;ip</w:t>
+      </w:r>
+      <w:r>
+        <w:rPr>
+          <w:b/>
+          <w:bCs/>
+          <w:sz w:val="28"/>
+          <w:szCs w:val="28"/>
+          <w:lang w:val="en-US"/>
+        </w:rPr>
+        <w:t>&gt;,</w:t>
+      </w:r>
+      <w:r>
+        <w:rPr>
+          <w:sz w:val="28"/>
+          <w:szCs w:val="28"/>
+          <w:lang w:val="en-US"/>
+        </w:rPr>
+        <w:t xml:space="preserve"> which shows us the </w:t>
+      </w:r>
+      <w:r>
+        <w:rPr>
+          <w:sz w:val="28"/>
+          <w:szCs w:val="28"/>
+          <w:lang w:val="en-US"/>
+        </w:rPr>
+        <w:t>TCP</w:t>
+      </w:r>
+      <w:r>
+        <w:rPr>
+          <w:sz w:val="28"/>
+          <w:szCs w:val="28"/>
+          <w:lang w:val="en-US"/>
+        </w:rPr>
+        <w:t xml:space="preserve"> connections on our destination host.</w:t>
+      </w:r>
+    </w:p>
+    <w:p>
+      <w:pPr>
+        <w:pStyle w:val="ListParagraph"/>
+        <w:numPr>
+          <w:ilvl w:val="0"/>
+          <w:numId w:val="2"/>
+        </w:numPr>
+        <w:rPr>
+          <w:sz w:val="28"/>
+          <w:szCs w:val="28"/>
+          <w:lang w:val="en-US"/>
+        </w:rPr>
+      </w:pPr>
+      <w:r>
+        <w:rPr>
+          <w:b/>
+          <w:bCs/>
+          <w:sz w:val="28"/>
+          <w:szCs w:val="28"/>
+          <w:lang w:val="en-US"/>
+        </w:rPr>
+        <w:t>nmap -sT -sV -Pn &lt;ip&gt;,</w:t>
+      </w:r>
+      <w:r>
+        <w:rPr>
+          <w:sz w:val="28"/>
+          <w:szCs w:val="28"/>
+          <w:lang w:val="en-US"/>
+        </w:rPr>
+        <w:t xml:space="preserve"> added the </w:t>
+      </w:r>
+      <w:r>
+        <w:rPr>
+          <w:b/>
+          <w:bCs/>
+          <w:sz w:val="28"/>
+          <w:szCs w:val="28"/>
+          <w:lang w:val="en-US"/>
+        </w:rPr>
+        <w:t>-sV</w:t>
+      </w:r>
+      <w:r>
+        <w:rPr>
+          <w:sz w:val="28"/>
+          <w:szCs w:val="28"/>
+          <w:lang w:val="en-US"/>
+        </w:rPr>
+        <w:t xml:space="preserve"> option, which informs us of the version of the running services.</w:t>
+      </w:r>
+    </w:p>
+    <w:p>
+      <w:pPr>
+        <w:pStyle w:val="ListParagraph"/>
+        <w:numPr>
+          <w:ilvl w:val="0"/>
+          <w:numId w:val="2"/>
+        </w:numPr>
+        <w:rPr>
+          <w:sz w:val="28"/>
+          <w:szCs w:val="28"/>
+          <w:lang w:val="en-US"/>
+        </w:rPr>
+      </w:pPr>
+      <w:r>
+        <w:rPr>
+          <w:b/>
+          <w:bCs/>
+          <w:sz w:val="28"/>
+          <w:szCs w:val="28"/>
+          <w:lang w:val="en-US"/>
+        </w:rPr>
+        <w:t xml:space="preserve">nmap -sT -Pn  --script “ssh-*” &lt;ip&gt;, </w:t>
+      </w:r>
+      <w:r>
+        <w:rPr>
+          <w:sz w:val="28"/>
+          <w:szCs w:val="28"/>
+          <w:lang w:val="en-US"/>
+        </w:rPr>
+        <w:t xml:space="preserve">this command executes all available NSE SSH scripts. </w:t>
+      </w:r>
+      <w:r>
+        <w:rPr>
+          <w:sz w:val="28"/>
+          <w:szCs w:val="28"/>
+          <w:lang w:val="en-US"/>
+        </w:rPr>
+        <w:t>We performed service enumeration to gather additional information about the SSH service</w:t>
+      </w:r>
+      <w:r>
+        <w:rPr>
+          <w:sz w:val="28"/>
+          <w:szCs w:val="28"/>
+          <w:lang w:val="en-US"/>
+        </w:rPr>
+        <w:t>.</w:t>
+      </w:r>
+      <w:r>
+        <w:rPr>
+          <w:sz w:val="28"/>
+          <w:szCs w:val="28"/>
+          <w:lang w:val="en-US"/>
+        </w:rPr>
+        <w:t xml:space="preserve"> The collected information was then </w:t>
+      </w:r>
+      <w:r>
+        <w:rPr>
+          <w:sz w:val="28"/>
+          <w:szCs w:val="28"/>
+          <w:lang w:val="en-US"/>
+        </w:rPr>
+        <w:t>used</w:t>
+      </w:r>
+      <w:r>
+        <w:rPr>
+          <w:sz w:val="28"/>
+          <w:szCs w:val="28"/>
+          <w:lang w:val="en-US"/>
+        </w:rPr>
+        <w:t xml:space="preserve"> to assess whether any known vulnerabilities or security weaknesses were present.</w:t>
+      </w:r>
+      <w:r>
+        <w:rPr>
+          <w:sz w:val="28"/>
+          <w:szCs w:val="28"/>
+          <w:lang w:val="en-US"/>
+        </w:rPr>
+        <w:t xml:space="preserve"> </w:t>
+      </w:r>
+    </w:p>
+    <w:p>
+      <w:pPr>
+        <w:rPr>
+          <w:sz w:val="28"/>
+          <w:szCs w:val="28"/>
+          <w:lang w:val="en-US"/>
+        </w:rPr>
+      </w:pPr>
+      <w:r>
+        <w:rPr>
+          <w:sz w:val="28"/>
+          <w:szCs w:val="28"/>
+          <w:lang w:val="en-US"/>
+        </w:rPr>
+        <w:t>By enumerating we mean:</w:t>
+      </w:r>
+    </w:p>
+    <w:p>
+      <w:pPr>
+        <w:pStyle w:val="ListParagraph"/>
+        <w:numPr>
+          <w:ilvl w:val="0"/>
+          <w:numId w:val="2"/>
+        </w:numPr>
+        <w:rPr>
+          <w:sz w:val="28"/>
+          <w:szCs w:val="28"/>
+          <w:lang w:val="en-US"/>
+        </w:rPr>
+      </w:pPr>
+      <w:r>
+        <w:rPr>
+          <w:sz w:val="28"/>
+          <w:szCs w:val="28"/>
+          <w:lang w:val="en-US"/>
+        </w:rPr>
+        <w:t>Authentication methods</w:t>
+      </w:r>
+      <w:r>
+        <w:rPr>
+          <w:sz w:val="28"/>
+          <w:szCs w:val="28"/>
+          <w:lang w:val="en-US"/>
+        </w:rPr>
+        <w:t>.</w:t>
+      </w:r>
+    </w:p>
+    <w:p>
+      <w:pPr>
+        <w:pStyle w:val="ListParagraph"/>
+        <w:numPr>
+          <w:ilvl w:val="0"/>
+          <w:numId w:val="2"/>
+        </w:numPr>
+        <w:rPr>
+          <w:sz w:val="28"/>
+          <w:szCs w:val="28"/>
+          <w:lang w:val="en-US"/>
+        </w:rPr>
+      </w:pPr>
+      <w:r>
+        <w:rPr>
+          <w:sz w:val="28"/>
+          <w:szCs w:val="28"/>
+          <w:lang w:val="en-US"/>
+        </w:rPr>
+        <w:t>Password brute-force testing</w:t>
+      </w:r>
+      <w:r>
+        <w:rPr>
+          <w:sz w:val="28"/>
+          <w:szCs w:val="28"/>
+          <w:lang w:val="en-US"/>
+        </w:rPr>
+        <w:t xml:space="preserve"> (Only if permitted</w:t>
+      </w:r>
+      <w:r>
+        <w:rPr>
+          <w:sz w:val="28"/>
+          <w:szCs w:val="28"/>
+          <w:lang w:val="en-US"/>
+        </w:rPr>
+        <w:t>)</w:t>
+      </w:r>
+      <w:r>
+        <w:rPr>
+          <w:sz w:val="28"/>
+          <w:szCs w:val="28"/>
+          <w:lang w:val="en-US"/>
+        </w:rPr>
+        <w:t>.</w:t>
+      </w:r>
+    </w:p>
+    <w:p>
+      <w:pPr>
+        <w:pStyle w:val="ListParagraph"/>
+        <w:numPr>
+          <w:ilvl w:val="0"/>
+          <w:numId w:val="2"/>
+        </w:numPr>
+        <w:rPr>
+          <w:sz w:val="28"/>
+          <w:szCs w:val="28"/>
+          <w:lang w:val="en-US"/>
+        </w:rPr>
+      </w:pPr>
+      <w:r>
+        <w:rPr>
+          <w:sz w:val="28"/>
+          <w:szCs w:val="28"/>
+          <w:lang w:val="en-US"/>
+        </w:rPr>
+        <w:t>Finding if public keys are accepted</w:t>
+      </w:r>
+      <w:r>
+        <w:rPr>
+          <w:sz w:val="28"/>
+          <w:szCs w:val="28"/>
+          <w:lang w:val="en-US"/>
+        </w:rPr>
+        <w:t>.</w:t>
+      </w:r>
+    </w:p>
+    <w:p>
+      <w:pPr>
+        <w:pStyle w:val="ListParagraph"/>
+        <w:numPr>
+          <w:ilvl w:val="0"/>
+          <w:numId w:val="2"/>
+        </w:numPr>
+        <w:rPr>
+          <w:sz w:val="28"/>
+          <w:szCs w:val="28"/>
+          <w:lang w:val="en-US"/>
+        </w:rPr>
+      </w:pPr>
+      <w:r>
+        <w:rPr>
+          <w:sz w:val="28"/>
+          <w:szCs w:val="28"/>
+          <w:lang w:val="en-US"/>
+        </w:rPr>
+        <w:t>Finding available host-keys</w:t>
+      </w:r>
+      <w:r>
+        <w:rPr>
+          <w:sz w:val="28"/>
+          <w:szCs w:val="28"/>
+          <w:lang w:val="en-US"/>
+        </w:rPr>
+        <w:t>.</w:t>
+      </w:r>
+    </w:p>
+    <w:p>
+      <w:pPr>
+        <w:pStyle w:val="ListParagraph"/>
+        <w:numPr>
+          <w:ilvl w:val="0"/>
+          <w:numId w:val="2"/>
+        </w:numPr>
+        <w:rPr>
+          <w:sz w:val="28"/>
+          <w:szCs w:val="28"/>
+          <w:lang w:val="en-US"/>
+        </w:rPr>
+      </w:pPr>
+      <w:r>
+        <w:rPr>
+          <w:sz w:val="28"/>
+          <w:szCs w:val="28"/>
+          <w:lang w:val="en-US"/>
+        </w:rPr>
+        <w:t>Evaluating vulnerability risks.</w:t>
+      </w:r>
+    </w:p>
+    <w:p>
+      <w:pPr>
+        <w:pStyle w:val="Heading2"/>
+        <w:rPr>
+          <w:lang w:val="en-US"/>
+        </w:rPr>
+      </w:pPr>
+      <w:r>
+        <w:rPr>
+          <w:lang w:val="en-US"/>
+        </w:rPr>
+        <w:t>Phase 4 – Findings</w:t>
+      </w:r>
+    </w:p>
+    <w:p>
+      <w:pPr>
+        <w:rPr>
+          <w:sz w:val="28"/>
+          <w:szCs w:val="28"/>
+          <w:lang w:val="en-US"/>
+        </w:rPr>
+      </w:pPr>
+      <w:r>
+        <w:rPr>
+          <w:sz w:val="28"/>
+          <w:szCs w:val="28"/>
+          <w:lang w:val="en-US"/>
+        </w:rPr>
+        <w:t xml:space="preserve">During this procedure </w:t>
+      </w:r>
+      <w:r>
+        <w:rPr>
+          <w:sz w:val="28"/>
+          <w:szCs w:val="28"/>
+          <w:lang w:val="en-US"/>
+        </w:rPr>
+        <w:t>I</w:t>
+      </w:r>
+      <w:r>
+        <w:rPr>
+          <w:sz w:val="28"/>
+          <w:szCs w:val="28"/>
+          <w:lang w:val="en-US"/>
+        </w:rPr>
+        <w:t xml:space="preserve"> found: </w:t>
+      </w:r>
+    </w:p>
+    <w:p>
+      <w:pPr>
+        <w:rPr>
+          <w:lang w:val="en-US"/>
+        </w:rPr>
+      </w:pPr>
+      <w:r>
+        <w:rPr>
+          <w:lang w:val="en-US"/>
+        </w:rPr>
+        <w:t>Running service: OpenSSH</w:t>
+      </w:r>
+    </w:p>
+    <w:p>
+      <w:pPr>
+        <w:rPr>
+          <w:lang w:val="en-US"/>
+        </w:rPr>
+      </w:pPr>
+      <w:r>
+        <w:rPr>
+          <w:lang w:val="en-US"/>
+        </w:rPr>
+        <w:t>Version:</w:t>
+      </w:r>
+      <w:r>
+        <w:rPr>
+          <w:lang w:val="en-US"/>
+        </w:rPr>
+        <w:t xml:space="preserve"> OpenSSH 10.2p1</w:t>
+      </w:r>
+    </w:p>
+    <w:p>
+      <w:pPr>
+        <w:rPr>
+          <w:lang w:val="en-US"/>
+        </w:rPr>
+      </w:pPr>
+      <w:r>
+        <w:rPr>
+          <w:lang w:val="en-US"/>
+        </w:rPr>
+        <w:t>Port: 22/TCP</w:t>
+      </w:r>
+    </w:p>
+    <w:p>
+      <w:pPr>
+        <w:rPr>
+          <w:lang w:val="en-US"/>
+        </w:rPr>
+      </w:pPr>
+      <w:r>
+        <w:rPr>
+          <w:lang w:val="en-US"/>
+        </w:rPr>
+        <w:t>Risk: Low</w:t>
+      </w:r>
+    </w:p>
+    <w:p>
+      <w:pPr>
+        <w:rPr>
+          <w:lang w:val="en-US"/>
+        </w:rPr>
+      </w:pPr>
+      <w:r>
+        <w:rPr>
+          <w:lang w:val="en-US"/>
+        </w:rPr>
+        <w:t xml:space="preserve">Evidence: Port 22 responded to TCP Connect Scan. Version detection identified OpenSSH 10.2p1. No obvious vulnerabilities or </w:t>
+      </w:r>
+      <w:r>
+        <w:rPr>
+          <w:lang w:val="en-US"/>
+        </w:rPr>
+        <w:t>weak credentials</w:t>
+      </w:r>
+      <w:r>
+        <w:rPr>
+          <w:lang w:val="en-US"/>
+        </w:rPr>
+        <w:t xml:space="preserve"> were identified during the performed enumeration.</w:t>
+      </w:r>
+    </w:p>
+    <w:p>
+      <w:pPr>
+        <w:rPr>
+          <w:lang w:val="en-US"/>
+        </w:rPr>
+      </w:pPr>
+      <w:r>
+        <w:rPr>
+          <w:lang w:val="en-US"/>
+        </w:rPr>
+        <w:lastRenderedPageBreak/>
+        <w:t xml:space="preserve">Recommendations : Continue patch management. Use strong passwords. </w:t>
+      </w:r>
+      <w:r>
+        <w:rPr>
+          <w:lang w:val="en-US"/>
+        </w:rPr>
+        <w:t xml:space="preserve">Prefer key-based authentication. </w:t>
+      </w:r>
+      <w:r>
+        <w:rPr>
+          <w:lang w:val="en-US"/>
+        </w:rPr>
+        <w:t>Disable root login if not required. Restrict SSH access from using firewall rules.</w:t>
       </w:r>
     </w:p>
     <w:sectPr>
@@ -275,8 +1645,124 @@
       </w:pPr>
     </w:lvl>
   </w:abstractNum>
+  <w:abstractNum w:abstractNumId="1" w15:restartNumberingAfterBreak="0">
+    <w:nsid w:val="474F76FF"/>
+    <w:multiLevelType w:val="hybridMultilevel"/>
+    <w:tmpl w:val="BDAA9BB6"/>
+    <w:lvl w:ilvl="0" w:tplc="F0B031F4">
+      <w:start w:val="1"/>
+      <w:numFmt w:val="bullet"/>
+      <w:lvlText w:val="-"/>
+      <w:lvlJc w:val="left"/>
+      <w:pPr>
+        <w:ind w:left="720" w:hanging="360"/>
+      </w:pPr>
+      <w:rPr>
+        <w:rFonts w:ascii="Aptos" w:eastAsiaTheme="minorHAnsi" w:hAnsi="Aptos" w:cstheme="minorBidi" w:hint="default"/>
+      </w:rPr>
+    </w:lvl>
+    <w:lvl w:ilvl="1" w:tplc="04080003">
+      <w:start w:val="1"/>
+      <w:numFmt w:val="bullet"/>
+      <w:lvlText w:val="o"/>
+      <w:lvlJc w:val="left"/>
+      <w:pPr>
+        <w:ind w:left="1440" w:hanging="360"/>
+      </w:pPr>
+      <w:rPr>
+        <w:rFonts w:ascii="Courier New" w:hAnsi="Courier New" w:cs="Courier New" w:hint="default"/>
+      </w:rPr>
+    </w:lvl>
+    <w:lvl w:ilvl="2" w:tplc="04080005" w:tentative="1">
+      <w:start w:val="1"/>
+      <w:numFmt w:val="bullet"/>
+      <w:lvlText w:val=""/>
+      <w:lvlJc w:val="left"/>
+      <w:pPr>
+        <w:ind w:left="2160" w:hanging="360"/>
+      </w:pPr>
+      <w:rPr>
+        <w:rFonts w:ascii="Wingdings" w:hAnsi="Wingdings" w:hint="default"/>
+      </w:rPr>
+    </w:lvl>
+    <w:lvl w:ilvl="3" w:tplc="04080001" w:tentative="1">
+      <w:start w:val="1"/>
+      <w:numFmt w:val="bullet"/>
+      <w:lvlText w:val=""/>
+      <w:lvlJc w:val="left"/>
+      <w:pPr>
+        <w:ind w:left="2880" w:hanging="360"/>
+      </w:pPr>
+      <w:rPr>
+        <w:rFonts w:ascii="Symbol" w:hAnsi="Symbol" w:hint="default"/>
+      </w:rPr>
+    </w:lvl>
+    <w:lvl w:ilvl="4" w:tplc="04080003" w:tentative="1">
+      <w:start w:val="1"/>
+      <w:numFmt w:val="bullet"/>
+      <w:lvlText w:val="o"/>
+      <w:lvlJc w:val="left"/>
+      <w:pPr>
+        <w:ind w:left="3600" w:hanging="360"/>
+      </w:pPr>
+      <w:rPr>
+        <w:rFonts w:ascii="Courier New" w:hAnsi="Courier New" w:cs="Courier New" w:hint="default"/>
+      </w:rPr>
+    </w:lvl>
+    <w:lvl w:ilvl="5" w:tplc="04080005" w:tentative="1">
+      <w:start w:val="1"/>
+      <w:numFmt w:val="bullet"/>
+      <w:lvlText w:val=""/>
+      <w:lvlJc w:val="left"/>
+      <w:pPr>
+        <w:ind w:left="4320" w:hanging="360"/>
+      </w:pPr>
+      <w:rPr>
+        <w:rFonts w:ascii="Wingdings" w:hAnsi="Wingdings" w:hint="default"/>
+      </w:rPr>
+    </w:lvl>
+    <w:lvl w:ilvl="6" w:tplc="04080001" w:tentative="1">
+      <w:start w:val="1"/>
+      <w:numFmt w:val="bullet"/>
+      <w:lvlText w:val=""/>
+      <w:lvlJc w:val="left"/>
+      <w:pPr>
+        <w:ind w:left="5040" w:hanging="360"/>
+      </w:pPr>
+      <w:rPr>
+        <w:rFonts w:ascii="Symbol" w:hAnsi="Symbol" w:hint="default"/>
+      </w:rPr>
+    </w:lvl>
+    <w:lvl w:ilvl="7" w:tplc="04080003" w:tentative="1">
+      <w:start w:val="1"/>
+      <w:numFmt w:val="bullet"/>
+      <w:lvlText w:val="o"/>
+      <w:lvlJc w:val="left"/>
+      <w:pPr>
+        <w:ind w:left="5760" w:hanging="360"/>
+      </w:pPr>
+      <w:rPr>
+        <w:rFonts w:ascii="Courier New" w:hAnsi="Courier New" w:cs="Courier New" w:hint="default"/>
+      </w:rPr>
+    </w:lvl>
+    <w:lvl w:ilvl="8" w:tplc="04080005" w:tentative="1">
+      <w:start w:val="1"/>
+      <w:numFmt w:val="bullet"/>
+      <w:lvlText w:val=""/>
+      <w:lvlJc w:val="left"/>
+      <w:pPr>
+        <w:ind w:left="6480" w:hanging="360"/>
+      </w:pPr>
+      <w:rPr>
+        <w:rFonts w:ascii="Wingdings" w:hAnsi="Wingdings" w:hint="default"/>
+      </w:rPr>
+    </w:lvl>
+  </w:abstractNum>
   <w:num w:numId="1" w16cid:durableId="442652953">
     <w:abstractNumId w:val="0"/>
+  </w:num>
+  <w:num w:numId="2" w16cid:durableId="1214268713">
+    <w:abstractNumId w:val="1"/>
   </w:num>
 </w:numbering>
 </file>
@@ -709,7 +2195,6 @@
     <w:next w:val="Normal"/>
     <w:link w:val="Heading2Char"/>
     <w:uiPriority w:val="9"/>
-    <w:semiHidden/>
     <w:unhideWhenUsed/>
     <w:qFormat/>
     <w:rsid w:val="008D03B1"/>
@@ -926,7 +2411,6 @@
     <w:basedOn w:val="DefaultParagraphFont"/>
     <w:link w:val="Heading2"/>
     <w:uiPriority w:val="9"/>
-    <w:semiHidden/>
     <w:rsid w:val="008D03B1"/>
     <w:rPr>
       <w:rFonts w:asciiTheme="majorHAnsi" w:eastAsiaTheme="majorEastAsia" w:hAnsiTheme="majorHAnsi" w:cstheme="majorBidi"/>

</xml_diff>

<commit_message>
Maybe it'll work now
</commit_message>
<xml_diff>
--- a/Documentation.docx
+++ b/Documentation.docx
@@ -1503,7 +1503,7 @@
         <w:rPr>
           <w:lang w:val="en-US"/>
         </w:rPr>
-        <w:t xml:space="preserve">Evidence: Port 22 responded to TCP Connect Scan. Version detection identified OpenSSH 10.2p1. No obvious vulnerabilities or </w:t>
+        <w:t xml:space="preserve">Evidence Port 22 responded to TCP Connect Scan. Version detection identified OpenSSH 10.2p1. No obvious vulnerabilities or </w:t>
       </w:r>
       <w:r>
         <w:rPr>
@@ -1529,7 +1529,13 @@
           <w:lang w:val="en-US"/>
         </w:rPr>
         <w:lastRenderedPageBreak/>
-        <w:t xml:space="preserve">Recommendations : Continue patch management. Use strong passwords. </w:t>
+        <w:t>Recommendations:</w:t>
+      </w:r>
+      <w:r>
+        <w:rPr>
+          <w:lang w:val="en-US"/>
+        </w:rPr>
+        <w:t xml:space="preserve"> Continue patch management. Use strong passwords. </w:t>
       </w:r>
       <w:r>
         <w:rPr>

</xml_diff>